<commit_message>
Part 1: summarise the discovery notes instead of quoting them
The repository is public now. The analysis table quoted the client's own words
from the brief; those cells are now my summary of each point. The brief asks for
a documented understanding of the workflow, so summarising is the assignment
rather than a concession, and it keeps the client's prompt out of a public repo.
</commit_message>
<xml_diff>
--- a/docs/PART1_Requirements_and_Workflow_Analysis.docx
+++ b/docs/PART1_Requirements_and_Workflow_Analysis.docx
@@ -68,7 +68,7 @@
           <w:b w:val="0"/>
           <w:sz w:val="21"/>
         </w:rPr>
-        <w:t>I read the discovery notes twice: once for the process, and once for the places where Priya's wording gives away where it breaks. The second read is where the design came from.</w:t>
+        <w:t>I read the discovery notes twice: once for the process, and once for the places where her wording gives away where it breaks. The second read is where the design came from.</w:t>
       </w:r>
     </w:p>
     <w:tbl>
@@ -97,7 +97,7 @@
                 <w:b/>
                 <w:sz w:val="19"/>
               </w:rPr>
-              <w:t>What she said</w:t>
+              <w:t>What she described</w:t>
             </w:r>
           </w:p>
         </w:tc>
@@ -135,7 +135,7 @@
                 <w:b w:val="0"/>
                 <w:sz w:val="19"/>
               </w:rPr>
-              <w:t>"our AE sends an email to our CS team inbox with the customer name and the Salesforce opportunity link"</w:t>
+              <w:t>The trigger is an AE email to a shared CS inbox, carrying the customer name and an opportunity link</w:t>
             </w:r>
           </w:p>
         </w:tc>
@@ -173,7 +173,7 @@
                 <w:b w:val="0"/>
                 <w:sz w:val="19"/>
               </w:rPr>
-              <w:t>"manually create a project in Asana with our standard onboarding template, about 15 tasks across 4 phases"</w:t>
+              <w:t>A project is created by hand from a standard template of roughly 15 tasks across 4 phases</w:t>
             </w:r>
           </w:p>
         </w:tc>
@@ -211,7 +211,7 @@
                 <w:b w:val="0"/>
                 <w:sz w:val="19"/>
               </w:rPr>
-              <w:t>"create a shared Slack channel with the customer and schedule the kickoff call"</w:t>
+              <w:t>A shared customer Slack channel is opened and a kickoff call scheduled, both by hand</w:t>
             </w:r>
           </w:p>
         </w:tc>
@@ -249,7 +249,7 @@
                 <w:b w:val="0"/>
                 <w:sz w:val="19"/>
               </w:rPr>
-              <w:t>"If a task is blocked for more than 3 days, we're supposed to escalate, but honestly, that falls through the cracks a lot"</w:t>
+              <w:t>A 3-day block is supposed to escalate, and she volunteered that in practice it often does not</w:t>
             </w:r>
           </w:p>
         </w:tc>
@@ -287,7 +287,7 @@
                 <w:b w:val="0"/>
                 <w:sz w:val="19"/>
               </w:rPr>
-              <w:t>"Some customers are on our Enterprise plan ... Others are on Growth ... We sometimes mix up the templates"</w:t>
+              <w:t>Enterprise and Growth have different plans and CSM models, and the templates get mixed up</w:t>
             </w:r>
           </w:p>
         </w:tc>
@@ -325,7 +325,7 @@
                 <w:b w:val="0"/>
                 <w:sz w:val="19"/>
               </w:rPr>
-              <w:t>"data migration tasks were marked done but the customer's data wasn't actually verified"</w:t>
+              <w:t>Migration tasks have been marked done without the data actually being verified</w:t>
             </w:r>
           </w:p>
         </w:tc>

</xml_diff>